<commit_message>
NFIF-pris: banestatistikk og gateløp som separate pakker
Co-Authored-By: Claude Opus 5.5 <noreply@anthropic.com>
</commit_message>
<xml_diff>
--- a/NFIFProsjekt/tilbud/PRISANSLAG_SVAR.docx
+++ b/NFIFProsjekt/tilbud/PRISANSLAG_SVAR.docx
@@ -15,7 +15,7 @@
         <w:pStyle w:val="Subtitle"/>
       </w:pPr>
       <w:r>
-        <w:t xml:space="preserve">Gjennomgang og utkast · 27.09.2026</w:t>
+        <w:t xml:space="preserve">Gjennomgang og utkast · 27.09.2026 · versjon 2, to pakker</w:t>
       </w:r>
     </w:p>
     <w:bookmarkStart w:id="9" w:name="hva-du-bør-sende"/>
@@ -32,19 +32,7 @@
         <w:pStyle w:val="FirstParagraph"/>
       </w:pPr>
       <w:r>
-        <w:t xml:space="preserve">NFIF ber om et foreløpig og uforpliktende anslag på fire ting: etablering,</w:t>
-      </w:r>
-      <w:r>
-        <w:t xml:space="preserve"> </w:t>
-      </w:r>
-      <w:r>
-        <w:t xml:space="preserve">årlig drift, utvikling utenfor fastprisen og samlet kostnad over fem år.</w:t>
-      </w:r>
-      <w:r>
-        <w:t xml:space="preserve"> </w:t>
-      </w:r>
-      <w:r>
-        <w:t xml:space="preserve">Svaret bør være en kort e-post som svarer på nettopp de fire punktene.</w:t>
+        <w:t xml:space="preserve">Prisen deles i to pakker og en liste med tillegg:</w:t>
       </w:r>
     </w:p>
     <w:p>
@@ -60,19 +48,25 @@
           <w:b/>
           <w:bCs/>
         </w:rPr>
-        <w:t xml:space="preserve">Fastpris på etablering og drift.</w:t>
-      </w:r>
-      <w:r>
-        <w:t xml:space="preserve"> </w:t>
-      </w:r>
-      <w:r>
-        <w:t xml:space="preserve">Det er de to postene NFIF trenger</w:t>
-      </w:r>
-      <w:r>
-        <w:t xml:space="preserve"> </w:t>
-      </w:r>
-      <w:r>
-        <w:t xml:space="preserve">forutsigbarhet på, og det tilbudet lovet å fastprise.</w:t>
+        <w:t xml:space="preserve">Nasjonal banestatistikk.</w:t>
+      </w:r>
+      <w:r>
+        <w:t xml:space="preserve"> </w:t>
+      </w:r>
+      <w:r>
+        <w:t xml:space="preserve">Det som er bygget, pluss det som mangler:</w:t>
+      </w:r>
+      <w:r>
+        <w:t xml:space="preserve"> </w:t>
+      </w:r>
+      <w:r>
+        <w:t xml:space="preserve">eldre statistikk, masters, og tre minstekrav fra kravspekken. Deretter</w:t>
+      </w:r>
+      <w:r>
+        <w:t xml:space="preserve"> </w:t>
+      </w:r>
+      <w:r>
+        <w:t xml:space="preserve">en årspris for drift, registrering og vedlikehold av basen.</w:t>
       </w:r>
     </w:p>
     <w:p>
@@ -88,19 +82,19 @@
           <w:b/>
           <w:bCs/>
         </w:rPr>
-        <w:t xml:space="preserve">Spenn på resten.</w:t>
-      </w:r>
-      <w:r>
-        <w:t xml:space="preserve"> </w:t>
-      </w:r>
-      <w:r>
-        <w:t xml:space="preserve">Integrasjoner, løp utenfor bane, aktivitetsmodul og</w:t>
-      </w:r>
-      <w:r>
-        <w:t xml:space="preserve"> </w:t>
-      </w:r>
-      <w:r>
-        <w:t xml:space="preserve">historikk oppgis med lav og høy verdi. Da svarer vi uten å binde oss.</w:t>
+        <w:t xml:space="preserve">Gateløp.</w:t>
+      </w:r>
+      <w:r>
+        <w:t xml:space="preserve"> </w:t>
+      </w:r>
+      <w:r>
+        <w:t xml:space="preserve">Egen pris for etablering og årlig drift. Kravspekken tillater</w:t>
+      </w:r>
+      <w:r>
+        <w:t xml:space="preserve"> </w:t>
+      </w:r>
+      <w:r>
+        <w:t xml:space="preserve">at gateløp kommer senere, så lenge NFIF får et veikart innen 31.12.2026.</w:t>
       </w:r>
     </w:p>
     <w:p>
@@ -116,31 +110,47 @@
           <w:b/>
           <w:bCs/>
         </w:rPr>
-        <w:t xml:space="preserve">Driftsprisen fordelt på fire poster.</w:t>
-      </w:r>
-      <w:r>
-        <w:t xml:space="preserve"> </w:t>
-      </w:r>
-      <w:r>
-        <w:t xml:space="preserve">Plattformdelen alene er</w:t>
-      </w:r>
-      <w:r>
-        <w:t xml:space="preserve"> </w:t>
-      </w:r>
-      <w:r>
-        <w:t xml:space="preserve">260 000 kr i året. Det er den delen NFIF vil sammenligne med en ren</w:t>
-      </w:r>
-      <w:r>
-        <w:t xml:space="preserve"> </w:t>
-      </w:r>
-      <w:r>
-        <w:t xml:space="preserve">statistikklisens, som trolig koster 150 000–300 000 kr i året. Uten</w:t>
-      </w:r>
-      <w:r>
-        <w:t xml:space="preserve"> </w:t>
-      </w:r>
-      <w:r>
-        <w:t xml:space="preserve">fordelingen sammenligner de 480 000 med den lisensen.</w:t>
+        <w:t xml:space="preserve">Tillegg som bestilles ved behov.</w:t>
+      </w:r>
+      <w:r>
+        <w:t xml:space="preserve"> </w:t>
+      </w:r>
+      <w:r>
+        <w:t xml:space="preserve">Integrasjoner, aktivitetsmodul,</w:t>
+      </w:r>
+      <w:r>
+        <w:t xml:space="preserve"> </w:t>
+      </w:r>
+      <w:r>
+        <w:t xml:space="preserve">analyse og timepris.</w:t>
+      </w:r>
+    </w:p>
+    <w:p>
+      <w:pPr>
+        <w:pStyle w:val="FirstParagraph"/>
+      </w:pPr>
+      <w:r>
+        <w:t xml:space="preserve">Oppdelingen gjør banestatistikken direkte sammenlignbar med en ren</w:t>
+      </w:r>
+      <w:r>
+        <w:t xml:space="preserve"> </w:t>
+      </w:r>
+      <w:r>
+        <w:t xml:space="preserve">statistikkleverandør. Årsprisen på 290 000 ligger i øvre del av det</w:t>
+      </w:r>
+      <w:r>
+        <w:t xml:space="preserve"> </w:t>
+      </w:r>
+      <w:r>
+        <w:t xml:space="preserve">Tilastopaja trolig tar, som er 150 000–300 000.</w:t>
+      </w:r>
+    </w:p>
+    <w:p>
+      <w:pPr>
+        <w:pStyle w:val="BodyText"/>
+      </w:pPr>
+      <w:r>
+        <w:t xml:space="preserve">Tre forhold bør du ta stilling til før du sender.</w:t>
       </w:r>
     </w:p>
     <w:p>
@@ -148,7 +158,7 @@
         <w:pStyle w:val="Compact"/>
         <w:numPr>
           <w:ilvl w:val="0"/>
-          <w:numId w:val="1001"/>
+          <w:numId w:val="1002"/>
         </w:numPr>
       </w:pPr>
       <w:r>
@@ -156,25 +166,31 @@
           <w:b/>
           <w:bCs/>
         </w:rPr>
-        <w:t xml:space="preserve">Fri tilgang for alle.</w:t>
-      </w:r>
-      <w:r>
-        <w:t xml:space="preserve"> </w:t>
-      </w:r>
-      <w:r>
-        <w:t xml:space="preserve">Én setning om at vi ikke tar betalt av klubber,</w:t>
-      </w:r>
-      <w:r>
-        <w:t xml:space="preserve"> </w:t>
-      </w:r>
-      <w:r>
-        <w:t xml:space="preserve">utøvere eller publikum. I Sverige betaler klubbene 5 000–13 450 SEK i året</w:t>
-      </w:r>
-      <w:r>
-        <w:t xml:space="preserve"> </w:t>
-      </w:r>
-      <w:r>
-        <w:t xml:space="preserve">for statistikken. Vi nevner ingen konkurrenter.</w:t>
+        <w:t xml:space="preserve">Tre minstekrav er lagt inn i banepakken.</w:t>
+      </w:r>
+      <w:r>
+        <w:t xml:space="preserve"> </w:t>
+      </w:r>
+      <w:r>
+        <w:t xml:space="preserve">Kvalitetsnivå for</w:t>
+      </w:r>
+      <w:r>
+        <w:t xml:space="preserve"> </w:t>
+      </w:r>
+      <w:r>
+        <w:t xml:space="preserve">resultater, API og kretsstatistikk er obligatoriske i kravspekken §22, men</w:t>
+      </w:r>
+      <w:r>
+        <w:t xml:space="preserve"> </w:t>
+      </w:r>
+      <w:r>
+        <w:t xml:space="preserve">ikke bygget. Står de utenfor pakken, oppfyller banepakken ikke kravene.</w:t>
+      </w:r>
+      <w:r>
+        <w:t xml:space="preserve"> </w:t>
+      </w:r>
+      <w:r>
+        <w:t xml:space="preserve">Til sammen utgjør de 350 000 av etableringen.</w:t>
       </w:r>
     </w:p>
     <w:p>
@@ -182,7 +198,7 @@
         <w:pStyle w:val="Compact"/>
         <w:numPr>
           <w:ilvl w:val="0"/>
-          <w:numId w:val="1001"/>
+          <w:numId w:val="1002"/>
         </w:numPr>
       </w:pPr>
       <w:r>
@@ -190,69 +206,67 @@
           <w:b/>
           <w:bCs/>
         </w:rPr>
-        <w:t xml:space="preserve">Tre femårstall.</w:t>
-      </w:r>
-      <w:r>
-        <w:t xml:space="preserve"> </w:t>
-      </w:r>
-      <w:r>
-        <w:t xml:space="preserve">Fastprisen alene, et realistisk scenario og alt</w:t>
-      </w:r>
-      <w:r>
-        <w:t xml:space="preserve"> </w:t>
-      </w:r>
-      <w:r>
-        <w:t xml:space="preserve">inkludert. Da ser NFIF både bunnen og taket.</w:t>
-      </w:r>
-    </w:p>
-    <w:p>
-      <w:pPr>
-        <w:pStyle w:val="FirstParagraph"/>
-      </w:pPr>
-      <w:r>
-        <w:t xml:space="preserve">Ikke sett ned prisen for å møte lisensnivået. Kostnadsgrunnlaget vårt</w:t>
-      </w:r>
-      <w:r>
-        <w:t xml:space="preserve"> </w:t>
-      </w:r>
-      <w:r>
-        <w:t xml:space="preserve">tåler det ikke, og tilbudet leverer vesentlig mer enn en lisens.</w:t>
-      </w:r>
-    </w:p>
-    <w:p>
-      <w:pPr>
-        <w:pStyle w:val="BodyText"/>
+        <w:t xml:space="preserve">Årsprisen gir liten margin.</w:t>
+      </w:r>
+      <w:r>
+        <w:t xml:space="preserve"> </w:t>
+      </w:r>
+      <w:r>
+        <w:t xml:space="preserve">290 000 i året dekker kostnadene med</w:t>
+      </w:r>
+      <w:r>
+        <w:t xml:space="preserve"> </w:t>
+      </w:r>
+      <w:r>
+        <w:t xml:space="preserve">mellom −45 000 og +77 000, etter prismodellen fra august. Fortjenesten</w:t>
+      </w:r>
+      <w:r>
+        <w:t xml:space="preserve"> </w:t>
+      </w:r>
+      <w:r>
+        <w:t xml:space="preserve">må komme fra gateløp, tillegg og analyse.</w:t>
+      </w:r>
+    </w:p>
+    <w:p>
+      <w:pPr>
+        <w:pStyle w:val="Compact"/>
+        <w:numPr>
+          <w:ilvl w:val="0"/>
+          <w:numId w:val="1002"/>
+        </w:numPr>
       </w:pPr>
       <w:r>
         <w:rPr>
           <w:b/>
           <w:bCs/>
         </w:rPr>
-        <w:t xml:space="preserve">Valgfritt:</w:t>
-      </w:r>
-      <w:r>
-        <w:t xml:space="preserve"> </w:t>
-      </w:r>
-      <w:r>
-        <w:t xml:space="preserve">Vil du gi NFIF mulighet til å komme lavere, kan du legge til</w:t>
-      </w:r>
-      <w:r>
-        <w:t xml:space="preserve"> </w:t>
-      </w:r>
-      <w:r>
-        <w:t xml:space="preserve">denne setningen under punkt 2 i e-posten: «Analysedelen kan tas ut eller</w:t>
-      </w:r>
-      <w:r>
-        <w:t xml:space="preserve"> </w:t>
-      </w:r>
-      <w:r>
-        <w:t xml:space="preserve">utvides etter NFIFs ønske.» Ulempen er at analysen er det som skiller oss</w:t>
-      </w:r>
-      <w:r>
-        <w:t xml:space="preserve"> </w:t>
-      </w:r>
-      <w:r>
-        <w:t xml:space="preserve">tydeligst fra andre, og at den er lett å kutte når den står som egen post.</w:t>
+        <w:t xml:space="preserve">Det er ingen fast utviklingspott lenger.</w:t>
+      </w:r>
+      <w:r>
+        <w:t xml:space="preserve"> </w:t>
+      </w:r>
+      <w:r>
+        <w:t xml:space="preserve">Alle endringer NFIF ønsker,</w:t>
+      </w:r>
+      <w:r>
+        <w:t xml:space="preserve"> </w:t>
+      </w:r>
+      <w:r>
+        <w:t xml:space="preserve">faktureres med timepris. Det er ryddig, men NFIF kan oppleve det som mindre</w:t>
+      </w:r>
+      <w:r>
+        <w:t xml:space="preserve"> </w:t>
+      </w:r>
+      <w:r>
+        <w:t xml:space="preserve">forutsigbart.</w:t>
+      </w:r>
+    </w:p>
+    <w:p>
+      <w:pPr>
+        <w:pStyle w:val="FirstParagraph"/>
+      </w:pPr>
+      <w:r>
+        <w:t xml:space="preserve">Ikke nevn konkurrenter i e-posten.</w:t>
       </w:r>
     </w:p>
     <w:bookmarkEnd w:id="9"/>
@@ -289,13 +303,13 @@
         <w:t xml:space="preserve"> </w:t>
       </w:r>
       <w:r>
-        <w:t xml:space="preserve">så regnes summene og femårstallene ut på nytt. Skriv deretter de nye tallene</w:t>
-      </w:r>
-      <w:r>
-        <w:t xml:space="preserve"> </w:t>
-      </w:r>
-      <w:r>
-        <w:t xml:space="preserve">inn i e-posten under. Tallene som skal rettes, er gulmarkert.</w:t>
+        <w:t xml:space="preserve">så regnes summene og femårstallene ut på nytt. Tallene som skal rettes i</w:t>
+      </w:r>
+      <w:r>
+        <w:t xml:space="preserve"> </w:t>
+      </w:r>
+      <w:r>
+        <w:t xml:space="preserve">e-posten, er gulmarkert.</w:t>
       </w:r>
     </w:p>
     <w:tbl>
@@ -357,7 +371,7 @@
               <w:pStyle w:val="Compact"/>
             </w:pPr>
             <w:r>
-              <w:t xml:space="preserve">Etablering</w:t>
+              <w:t xml:space="preserve">Plattform og datagrunnlag, overført</w:t>
             </w:r>
           </w:p>
         </w:tc>
@@ -369,18 +383,18 @@
               <w:jc w:val="right"/>
             </w:pPr>
             <w:r>
-              <w:t xml:space="preserve">950 000</w:t>
-            </w:r>
-          </w:p>
-        </w:tc>
-        <w:tc>
-          <w:tcPr/>
-          <w:p>
-            <w:pPr>
-              <w:pStyle w:val="Compact"/>
-            </w:pPr>
-            <w:r>
-              <w:t xml:space="preserve">Kostnad 840 000–1 020 000, 1 080–1 490 timer</w:t>
+              <w:t xml:space="preserve">250 000</w:t>
+            </w:r>
+          </w:p>
+        </w:tc>
+        <w:tc>
+          <w:tcPr/>
+          <w:p>
+            <w:pPr>
+              <w:pStyle w:val="Compact"/>
+            </w:pPr>
+            <w:r>
+              <w:t xml:space="preserve">Ditt valg: verdien av det som er bygget</w:t>
             </w:r>
           </w:p>
         </w:tc>
@@ -393,7 +407,7 @@
               <w:pStyle w:val="Compact"/>
             </w:pPr>
             <w:r>
-              <w:t xml:space="preserve">Drift og infrastruktur</w:t>
+              <w:t xml:space="preserve">Masters</w:t>
             </w:r>
           </w:p>
         </w:tc>
@@ -405,18 +419,18 @@
               <w:jc w:val="right"/>
             </w:pPr>
             <w:r>
-              <w:t xml:space="preserve">90 000 / år</w:t>
-            </w:r>
-          </w:p>
-        </w:tc>
-        <w:tc>
-          <w:tcPr/>
-          <w:p>
-            <w:pPr>
-              <w:pStyle w:val="Compact"/>
-            </w:pPr>
-            <w:r>
-              <w:t xml:space="preserve">Kostnad 63 000–135 000</w:t>
+              <w:t xml:space="preserve">100 000</w:t>
+            </w:r>
+          </w:p>
+        </w:tc>
+        <w:tc>
+          <w:tcPr/>
+          <w:p>
+            <w:pPr>
+              <w:pStyle w:val="Compact"/>
+            </w:pPr>
+            <w:r>
+              <w:t xml:space="preserve">80–120 timer</w:t>
             </w:r>
           </w:p>
         </w:tc>
@@ -429,7 +443,7 @@
               <w:pStyle w:val="Compact"/>
             </w:pPr>
             <w:r>
-              <w:t xml:space="preserve">Import, kontroll og support</w:t>
+              <w:t xml:space="preserve">Eldre statistikk</w:t>
             </w:r>
           </w:p>
         </w:tc>
@@ -441,18 +455,18 @@
               <w:jc w:val="right"/>
             </w:pPr>
             <w:r>
-              <w:t xml:space="preserve">170 000 / år</w:t>
-            </w:r>
-          </w:p>
-        </w:tc>
-        <w:tc>
-          <w:tcPr/>
-          <w:p>
-            <w:pPr>
-              <w:pStyle w:val="Compact"/>
-            </w:pPr>
-            <w:r>
-              <w:t xml:space="preserve">Ca. 250 timer, 150 000–200 000</w:t>
+              <w:t xml:space="preserve">200 000</w:t>
+            </w:r>
+          </w:p>
+        </w:tc>
+        <w:tc>
+          <w:tcPr/>
+          <w:p>
+            <w:pPr>
+              <w:pStyle w:val="Compact"/>
+            </w:pPr>
+            <w:r>
+              <w:t xml:space="preserve">180–320 timer, omfanget må avgrenses</w:t>
             </w:r>
           </w:p>
         </w:tc>
@@ -465,7 +479,7 @@
               <w:pStyle w:val="Compact"/>
             </w:pPr>
             <w:r>
-              <w:t xml:space="preserve">Videreutvikling, 175 timer</w:t>
+              <w:t xml:space="preserve">Dokumentasjon, DPIA, databehandleravtale</w:t>
             </w:r>
           </w:p>
         </w:tc>
@@ -477,18 +491,18 @@
               <w:jc w:val="right"/>
             </w:pPr>
             <w:r>
-              <w:t xml:space="preserve">140 000 / år</w:t>
-            </w:r>
-          </w:p>
-        </w:tc>
-        <w:tc>
-          <w:tcPr/>
-          <w:p>
-            <w:pPr>
-              <w:pStyle w:val="Compact"/>
-            </w:pPr>
-            <w:r>
-              <w:t xml:space="preserve">Tilsvarer 800 kr timen, rabatt mot 950</w:t>
+              <w:t xml:space="preserve">80 000</w:t>
+            </w:r>
+          </w:p>
+        </w:tc>
+        <w:tc>
+          <w:tcPr/>
+          <w:p>
+            <w:pPr>
+              <w:pStyle w:val="Compact"/>
+            </w:pPr>
+            <w:r>
+              <w:t xml:space="preserve">80–120 timer</w:t>
             </w:r>
           </w:p>
         </w:tc>
@@ -501,7 +515,7 @@
               <w:pStyle w:val="Compact"/>
             </w:pPr>
             <w:r>
-              <w:t xml:space="preserve">Analyse</w:t>
+              <w:t xml:space="preserve">Kvalitetsnivå A/B/C</w:t>
             </w:r>
           </w:p>
         </w:tc>
@@ -513,18 +527,90 @@
               <w:jc w:val="right"/>
             </w:pPr>
             <w:r>
-              <w:t xml:space="preserve">80 000 / år</w:t>
-            </w:r>
-          </w:p>
-        </w:tc>
-        <w:tc>
-          <w:tcPr/>
-          <w:p>
-            <w:pPr>
-              <w:pStyle w:val="Compact"/>
-            </w:pPr>
-            <w:r>
-              <w:t xml:space="preserve">Ca. 70 timer à 1 100 kr</w:t>
+              <w:t xml:space="preserve">140 000</w:t>
+            </w:r>
+          </w:p>
+        </w:tc>
+        <w:tc>
+          <w:tcPr/>
+          <w:p>
+            <w:pPr>
+              <w:pStyle w:val="Compact"/>
+            </w:pPr>
+            <w:r>
+              <w:t xml:space="preserve">120–160 timer, minstekrav</w:t>
+            </w:r>
+          </w:p>
+        </w:tc>
+      </w:tr>
+      <w:tr>
+        <w:tc>
+          <w:tcPr/>
+          <w:p>
+            <w:pPr>
+              <w:pStyle w:val="Compact"/>
+            </w:pPr>
+            <w:r>
+              <w:t xml:space="preserve">Dokumentert API</w:t>
+            </w:r>
+          </w:p>
+        </w:tc>
+        <w:tc>
+          <w:tcPr/>
+          <w:p>
+            <w:pPr>
+              <w:pStyle w:val="Compact"/>
+              <w:jc w:val="right"/>
+            </w:pPr>
+            <w:r>
+              <w:t xml:space="preserve">140 000</w:t>
+            </w:r>
+          </w:p>
+        </w:tc>
+        <w:tc>
+          <w:tcPr/>
+          <w:p>
+            <w:pPr>
+              <w:pStyle w:val="Compact"/>
+            </w:pPr>
+            <w:r>
+              <w:t xml:space="preserve">120–160 timer, minstekrav</w:t>
+            </w:r>
+          </w:p>
+        </w:tc>
+      </w:tr>
+      <w:tr>
+        <w:tc>
+          <w:tcPr/>
+          <w:p>
+            <w:pPr>
+              <w:pStyle w:val="Compact"/>
+            </w:pPr>
+            <w:r>
+              <w:t xml:space="preserve">Kretsstatistikk</w:t>
+            </w:r>
+          </w:p>
+        </w:tc>
+        <w:tc>
+          <w:tcPr/>
+          <w:p>
+            <w:pPr>
+              <w:pStyle w:val="Compact"/>
+              <w:jc w:val="right"/>
+            </w:pPr>
+            <w:r>
+              <w:t xml:space="preserve">70 000</w:t>
+            </w:r>
+          </w:p>
+        </w:tc>
+        <w:tc>
+          <w:tcPr/>
+          <w:p>
+            <w:pPr>
+              <w:pStyle w:val="Compact"/>
+            </w:pPr>
+            <w:r>
+              <w:t xml:space="preserve">60–90 timer, minstekrav</w:t>
             </w:r>
           </w:p>
         </w:tc>
@@ -541,7 +627,7 @@
                 <w:b/>
                 <w:bCs/>
               </w:rPr>
-              <w:t xml:space="preserve">Sum årlig drift</w:t>
+              <w:t xml:space="preserve">Etablering banestatistikk</w:t>
             </w:r>
           </w:p>
         </w:tc>
@@ -557,19 +643,16 @@
                 <w:b/>
                 <w:bCs/>
               </w:rPr>
-              <w:t xml:space="preserve">480 000 / år</w:t>
-            </w:r>
-          </w:p>
-        </w:tc>
-        <w:tc>
-          <w:tcPr/>
-          <w:p>
-            <w:pPr>
-              <w:pStyle w:val="Compact"/>
-            </w:pPr>
-            <w:r>
-              <w:t xml:space="preserve">Uendret fra august</w:t>
-            </w:r>
+              <w:t xml:space="preserve">980 000</w:t>
+            </w:r>
+          </w:p>
+        </w:tc>
+        <w:tc>
+          <w:tcPr/>
+          <w:p>
+            <w:pPr>
+              <w:pStyle w:val="Compact"/>
+            </w:pPr>
           </w:p>
         </w:tc>
       </w:tr>
@@ -581,7 +664,7 @@
               <w:pStyle w:val="Compact"/>
             </w:pPr>
             <w:r>
-              <w:t xml:space="preserve">Integrasjon per system</w:t>
+              <w:t xml:space="preserve">Drift og infrastruktur</w:t>
             </w:r>
           </w:p>
         </w:tc>
@@ -593,18 +676,18 @@
               <w:jc w:val="right"/>
             </w:pPr>
             <w:r>
-              <w:t xml:space="preserve">90 000–150 000</w:t>
-            </w:r>
-          </w:p>
-        </w:tc>
-        <w:tc>
-          <w:tcPr/>
-          <w:p>
-            <w:pPr>
-              <w:pStyle w:val="Compact"/>
-            </w:pPr>
-            <w:r>
-              <w:t xml:space="preserve">60–150 timer per system, med buffer</w:t>
+              <w:t xml:space="preserve">90 000 / år</w:t>
+            </w:r>
+          </w:p>
+        </w:tc>
+        <w:tc>
+          <w:tcPr/>
+          <w:p>
+            <w:pPr>
+              <w:pStyle w:val="Compact"/>
+            </w:pPr>
+            <w:r>
+              <w:t xml:space="preserve">Kostnad 63 000–135 000</w:t>
             </w:r>
           </w:p>
         </w:tc>
@@ -617,7 +700,7 @@
               <w:pStyle w:val="Compact"/>
             </w:pPr>
             <w:r>
-              <w:t xml:space="preserve">Løp utenfor bane</w:t>
+              <w:t xml:space="preserve">Registrering og vedlikehold</w:t>
             </w:r>
           </w:p>
         </w:tc>
@@ -629,18 +712,18 @@
               <w:jc w:val="right"/>
             </w:pPr>
             <w:r>
-              <w:t xml:space="preserve">450 000–600 000</w:t>
-            </w:r>
-          </w:p>
-        </w:tc>
-        <w:tc>
-          <w:tcPr/>
-          <w:p>
-            <w:pPr>
-              <w:pStyle w:val="Compact"/>
-            </w:pPr>
-            <w:r>
-              <w:t xml:space="preserve">360–520 timer, med buffer</w:t>
+              <w:t xml:space="preserve">200 000 / år</w:t>
+            </w:r>
+          </w:p>
+        </w:tc>
+        <w:tc>
+          <w:tcPr/>
+          <w:p>
+            <w:pPr>
+              <w:pStyle w:val="Compact"/>
+            </w:pPr>
+            <w:r>
+              <w:t xml:space="preserve">Ca. 250 timer</w:t>
             </w:r>
           </w:p>
         </w:tc>
@@ -653,7 +736,11 @@
               <w:pStyle w:val="Compact"/>
             </w:pPr>
             <w:r>
-              <w:t xml:space="preserve">Aktivitetsmodul og dashbord</w:t>
+              <w:rPr>
+                <w:b/>
+                <w:bCs/>
+              </w:rPr>
+              <w:t xml:space="preserve">Årlig banestatistikk</w:t>
             </w:r>
           </w:p>
         </w:tc>
@@ -665,19 +752,20 @@
               <w:jc w:val="right"/>
             </w:pPr>
             <w:r>
-              <w:t xml:space="preserve">200 000–300 000</w:t>
-            </w:r>
-          </w:p>
-        </w:tc>
-        <w:tc>
-          <w:tcPr/>
-          <w:p>
-            <w:pPr>
-              <w:pStyle w:val="Compact"/>
-            </w:pPr>
-            <w:r>
-              <w:t xml:space="preserve">Satt ned fordi aktivitetssiden er i drift</w:t>
-            </w:r>
+              <w:rPr>
+                <w:b/>
+                <w:bCs/>
+              </w:rPr>
+              <w:t xml:space="preserve">290 000 / år</w:t>
+            </w:r>
+          </w:p>
+        </w:tc>
+        <w:tc>
+          <w:tcPr/>
+          <w:p>
+            <w:pPr>
+              <w:pStyle w:val="Compact"/>
+            </w:pPr>
           </w:p>
         </w:tc>
       </w:tr>
@@ -689,7 +777,7 @@
               <w:pStyle w:val="Compact"/>
             </w:pPr>
             <w:r>
-              <w:t xml:space="preserve">Historisk utvidelse</w:t>
+              <w:t xml:space="preserve">Gateløp, etablering</w:t>
             </w:r>
           </w:p>
         </w:tc>
@@ -701,18 +789,18 @@
               <w:jc w:val="right"/>
             </w:pPr>
             <w:r>
-              <w:t xml:space="preserve">200 000–300 000</w:t>
-            </w:r>
-          </w:p>
-        </w:tc>
-        <w:tc>
-          <w:tcPr/>
-          <w:p>
-            <w:pPr>
-              <w:pStyle w:val="Compact"/>
-            </w:pPr>
-            <w:r>
-              <w:t xml:space="preserve">180–320 timer</w:t>
+              <w:t xml:space="preserve">450 000–600 000</w:t>
+            </w:r>
+          </w:p>
+        </w:tc>
+        <w:tc>
+          <w:tcPr/>
+          <w:p>
+            <w:pPr>
+              <w:pStyle w:val="Compact"/>
+            </w:pPr>
+            <w:r>
+              <w:t xml:space="preserve">360–520 timer</w:t>
             </w:r>
           </w:p>
         </w:tc>
@@ -725,6 +813,150 @@
               <w:pStyle w:val="Compact"/>
             </w:pPr>
             <w:r>
+              <w:t xml:space="preserve">Gateløp, årlig</w:t>
+            </w:r>
+          </w:p>
+        </w:tc>
+        <w:tc>
+          <w:tcPr/>
+          <w:p>
+            <w:pPr>
+              <w:pStyle w:val="Compact"/>
+              <w:jc w:val="right"/>
+            </w:pPr>
+            <w:r>
+              <w:t xml:space="preserve">100 000 / år</w:t>
+            </w:r>
+          </w:p>
+        </w:tc>
+        <w:tc>
+          <w:tcPr/>
+          <w:p>
+            <w:pPr>
+              <w:pStyle w:val="Compact"/>
+            </w:pPr>
+            <w:r>
+              <w:t xml:space="preserve">Mitt anslag</w:t>
+            </w:r>
+          </w:p>
+        </w:tc>
+      </w:tr>
+      <w:tr>
+        <w:tc>
+          <w:tcPr/>
+          <w:p>
+            <w:pPr>
+              <w:pStyle w:val="Compact"/>
+            </w:pPr>
+            <w:r>
+              <w:t xml:space="preserve">Integrasjon per system</w:t>
+            </w:r>
+          </w:p>
+        </w:tc>
+        <w:tc>
+          <w:tcPr/>
+          <w:p>
+            <w:pPr>
+              <w:pStyle w:val="Compact"/>
+              <w:jc w:val="right"/>
+            </w:pPr>
+            <w:r>
+              <w:t xml:space="preserve">90 000–150 000</w:t>
+            </w:r>
+          </w:p>
+        </w:tc>
+        <w:tc>
+          <w:tcPr/>
+          <w:p>
+            <w:pPr>
+              <w:pStyle w:val="Compact"/>
+            </w:pPr>
+            <w:r>
+              <w:t xml:space="preserve">60–150 timer</w:t>
+            </w:r>
+          </w:p>
+        </w:tc>
+      </w:tr>
+      <w:tr>
+        <w:tc>
+          <w:tcPr/>
+          <w:p>
+            <w:pPr>
+              <w:pStyle w:val="Compact"/>
+            </w:pPr>
+            <w:r>
+              <w:t xml:space="preserve">Aktivitetsmodul og dashbord</w:t>
+            </w:r>
+          </w:p>
+        </w:tc>
+        <w:tc>
+          <w:tcPr/>
+          <w:p>
+            <w:pPr>
+              <w:pStyle w:val="Compact"/>
+              <w:jc w:val="right"/>
+            </w:pPr>
+            <w:r>
+              <w:t xml:space="preserve">200 000–300 000</w:t>
+            </w:r>
+          </w:p>
+        </w:tc>
+        <w:tc>
+          <w:tcPr/>
+          <w:p>
+            <w:pPr>
+              <w:pStyle w:val="Compact"/>
+            </w:pPr>
+            <w:r>
+              <w:t xml:space="preserve">Aktivitetssiden finnes allerede</w:t>
+            </w:r>
+          </w:p>
+        </w:tc>
+      </w:tr>
+      <w:tr>
+        <w:tc>
+          <w:tcPr/>
+          <w:p>
+            <w:pPr>
+              <w:pStyle w:val="Compact"/>
+            </w:pPr>
+            <w:r>
+              <w:t xml:space="preserve">Analyse</w:t>
+            </w:r>
+          </w:p>
+        </w:tc>
+        <w:tc>
+          <w:tcPr/>
+          <w:p>
+            <w:pPr>
+              <w:pStyle w:val="Compact"/>
+              <w:jc w:val="right"/>
+            </w:pPr>
+            <w:r>
+              <w:t xml:space="preserve">80 000 / år</w:t>
+            </w:r>
+          </w:p>
+        </w:tc>
+        <w:tc>
+          <w:tcPr/>
+          <w:p>
+            <w:pPr>
+              <w:pStyle w:val="Compact"/>
+            </w:pPr>
+            <w:r>
+              <w:t xml:space="preserve">Ca. 70 timer à 1 100 kr</w:t>
+            </w:r>
+          </w:p>
+        </w:tc>
+      </w:tr>
+      <w:tr>
+        <w:tc>
+          <w:tcPr/>
+          <w:p>
+            <w:pPr>
+              <w:pStyle w:val="Compact"/>
+            </w:pPr>
+            <w:r>
               <w:t xml:space="preserve">Timepris utvikling / analyse</w:t>
             </w:r>
           </w:p>
@@ -747,9 +979,6 @@
             <w:pPr>
               <w:pStyle w:val="Compact"/>
             </w:pPr>
-            <w:r>
-              <w:t xml:space="preserve">Mellom egenkostnad og konsulenthus</w:t>
-            </w:r>
           </w:p>
         </w:tc>
       </w:tr>
@@ -759,13 +988,19 @@
         <w:pStyle w:val="BodyText"/>
       </w:pPr>
       <w:r>
-        <w:t xml:space="preserve">Fordelingen av de 480 000 på fire poster er ny og er mitt forslag. Summen er</w:t>
-      </w:r>
-      <w:r>
-        <w:t xml:space="preserve"> </w:t>
-      </w:r>
-      <w:r>
-        <w:t xml:space="preserve">den samme som i august.</w:t>
+        <w:t xml:space="preserve">Posten for plattform og datagrunnlag er den mest skjønnsmessige. Den skal</w:t>
+      </w:r>
+      <w:r>
+        <w:t xml:space="preserve"> </w:t>
+      </w:r>
+      <w:r>
+        <w:t xml:space="preserve">dekke det du alt har bygget. 250 000 tilsvarer om lag 260 timer, som er lavt</w:t>
+      </w:r>
+      <w:r>
+        <w:t xml:space="preserve"> </w:t>
+      </w:r>
+      <w:r>
+        <w:t xml:space="preserve">i forhold til arbeidet. Settes den høyere, øker etableringen tilsvarende.</w:t>
       </w:r>
     </w:p>
     <w:bookmarkEnd w:id="10"/>
@@ -823,7 +1058,27 @@
         <w:t xml:space="preserve"> </w:t>
       </w:r>
       <w:r>
-        <w:t xml:space="preserve">Etablering og årlig drift er likevel tall vi står ved.</w:t>
+        <w:t xml:space="preserve">Nasjonal banestatistikk er likevel et tall vi står ved.</w:t>
+      </w:r>
+    </w:p>
+    <w:p>
+      <w:pPr>
+        <w:pStyle w:val="BodyText"/>
+      </w:pPr>
+      <w:r>
+        <w:t xml:space="preserve">Vi har delt prisen i to deler: nasjonal banestatistikk og gateløp.</w:t>
+      </w:r>
+      <w:r>
+        <w:t xml:space="preserve"> </w:t>
+      </w:r>
+      <w:r>
+        <w:t xml:space="preserve">Banestatistikken kan være i drift 01.01.2027. Gateløp bygges i 2027, etter</w:t>
+      </w:r>
+      <w:r>
+        <w:t xml:space="preserve"> </w:t>
+      </w:r>
+      <w:r>
+        <w:t xml:space="preserve">et veikart som leveres innen utgangen av 2026.</w:t>
       </w:r>
     </w:p>
     <w:p>
@@ -835,7 +1090,7 @@
           <w:b/>
           <w:bCs/>
         </w:rPr>
-        <w:t xml:space="preserve">1. Etablering frem til operativ løsning 01.01.2027</w:t>
+        <w:t xml:space="preserve">1. Nasjonal banestatistikk</w:t>
       </w:r>
     </w:p>
     <w:p>
@@ -843,7 +1098,7 @@
         <w:pStyle w:val="BodyText"/>
       </w:pPr>
       <w:r>
-        <w:t xml:space="preserve">Fastpris</w:t>
+        <w:t xml:space="preserve">Etablering, fastpris</w:t>
       </w:r>
       <w:r>
         <w:t xml:space="preserve"> </w:t>
@@ -852,225 +1107,13 @@
         <w:rPr>
           <w:highlight w:val="yellow"/>
         </w:rPr>
-        <w:t xml:space="preserve">950 000</w:t>
-      </w:r>
-      <w:r>
-        <w:t xml:space="preserve"> </w:t>
-      </w:r>
-      <w:r>
-        <w:t xml:space="preserve">kr. Beløpet faktureres mot milepæler, ikke som</w:t>
-      </w:r>
-      <w:r>
-        <w:t xml:space="preserve"> </w:t>
-      </w:r>
-      <w:r>
-        <w:t xml:space="preserve">forskudd. Siste del faktureres først etter 90 dagers godkjent drift.</w:t>
-      </w:r>
-    </w:p>
-    <w:p>
-      <w:pPr>
-        <w:pStyle w:val="BodyText"/>
-      </w:pPr>
-      <w:r>
-        <w:t xml:space="preserve">Prisen er lavere enn for en løsning bygget fra bunnen, fordi plattformen,</w:t>
-      </w:r>
-      <w:r>
-        <w:t xml:space="preserve"> </w:t>
-      </w:r>
-      <w:r>
-        <w:t xml:space="preserve">datagrunnlaget fra 2013 og den daglige importen allerede er i drift.</w:t>
-      </w:r>
-    </w:p>
-    <w:p>
-      <w:pPr>
-        <w:pStyle w:val="BodyText"/>
-      </w:pPr>
-      <w:r>
-        <w:rPr>
-          <w:b/>
-          <w:bCs/>
-        </w:rPr>
-        <w:t xml:space="preserve">2. Årlig drift og forvaltning</w:t>
-      </w:r>
-    </w:p>
-    <w:p>
-      <w:pPr>
-        <w:pStyle w:val="BodyText"/>
-      </w:pPr>
-      <w:r>
-        <w:t xml:space="preserve">Fastpris</w:t>
-      </w:r>
-      <w:r>
-        <w:t xml:space="preserve"> </w:t>
-      </w:r>
-      <w:r>
-        <w:rPr>
-          <w:highlight w:val="yellow"/>
-        </w:rPr>
-        <w:t xml:space="preserve">480 000</w:t>
-      </w:r>
-      <w:r>
-        <w:t xml:space="preserve"> </w:t>
-      </w:r>
-      <w:r>
-        <w:t xml:space="preserve">kr per år, fordelt slik:</w:t>
-      </w:r>
-    </w:p>
-    <w:p>
-      <w:pPr>
-        <w:pStyle w:val="Compact"/>
-        <w:numPr>
-          <w:ilvl w:val="0"/>
-          <w:numId w:val="1002"/>
-        </w:numPr>
-      </w:pPr>
-      <w:r>
-        <w:t xml:space="preserve">Drift i EU/EØS, overvåking og sikkerhetskopi:</w:t>
-      </w:r>
-      <w:r>
-        <w:t xml:space="preserve"> </w:t>
-      </w:r>
-      <w:r>
-        <w:rPr>
-          <w:highlight w:val="yellow"/>
-        </w:rPr>
-        <w:t xml:space="preserve">90 000</w:t>
-      </w:r>
-      <w:r>
-        <w:t xml:space="preserve"> </w:t>
-      </w:r>
-      <w:r>
-        <w:t xml:space="preserve">kr</w:t>
-      </w:r>
-    </w:p>
-    <w:p>
-      <w:pPr>
-        <w:pStyle w:val="Compact"/>
-        <w:numPr>
-          <w:ilvl w:val="0"/>
-          <w:numId w:val="1002"/>
-        </w:numPr>
-      </w:pPr>
-      <w:r>
-        <w:t xml:space="preserve">Daglig import av resultater, kontroll mot kilden og support:</w:t>
-      </w:r>
-      <w:r>
-        <w:t xml:space="preserve"> </w:t>
-      </w:r>
-      <w:r>
-        <w:rPr>
-          <w:highlight w:val="yellow"/>
-        </w:rPr>
-        <w:t xml:space="preserve">170 000</w:t>
-      </w:r>
-      <w:r>
-        <w:t xml:space="preserve"> </w:t>
-      </w:r>
-      <w:r>
-        <w:t xml:space="preserve">kr</w:t>
-      </w:r>
-    </w:p>
-    <w:p>
-      <w:pPr>
-        <w:pStyle w:val="Compact"/>
-        <w:numPr>
-          <w:ilvl w:val="0"/>
-          <w:numId w:val="1002"/>
-        </w:numPr>
-      </w:pPr>
-      <w:r>
-        <w:t xml:space="preserve">Videreutvikling som NFIF prioriterer fritt,</w:t>
-      </w:r>
-      <w:r>
-        <w:t xml:space="preserve"> </w:t>
-      </w:r>
-      <w:r>
-        <w:rPr>
-          <w:highlight w:val="yellow"/>
-        </w:rPr>
-        <w:t xml:space="preserve">175</w:t>
-      </w:r>
-      <w:r>
-        <w:t xml:space="preserve"> </w:t>
-      </w:r>
-      <w:r>
-        <w:t xml:space="preserve">timer:</w:t>
-      </w:r>
-      <w:r>
-        <w:t xml:space="preserve"> </w:t>
-      </w:r>
-      <w:r>
-        <w:rPr>
-          <w:highlight w:val="yellow"/>
-        </w:rPr>
-        <w:t xml:space="preserve">140 000</w:t>
-      </w:r>
-      <w:r>
-        <w:t xml:space="preserve"> </w:t>
-      </w:r>
-      <w:r>
-        <w:t xml:space="preserve">kr</w:t>
-      </w:r>
-    </w:p>
-    <w:p>
-      <w:pPr>
-        <w:pStyle w:val="Compact"/>
-        <w:numPr>
-          <w:ilvl w:val="0"/>
-          <w:numId w:val="1002"/>
-        </w:numPr>
-      </w:pPr>
-      <w:r>
-        <w:t xml:space="preserve">Analyse, med to mesterskapspakker og én årsrapport:</w:t>
-      </w:r>
-      <w:r>
-        <w:t xml:space="preserve"> </w:t>
-      </w:r>
-      <w:r>
-        <w:rPr>
-          <w:highlight w:val="yellow"/>
-        </w:rPr>
-        <w:t xml:space="preserve">80 000</w:t>
-      </w:r>
-      <w:r>
-        <w:t xml:space="preserve"> </w:t>
-      </w:r>
-      <w:r>
-        <w:t xml:space="preserve">kr</w:t>
-      </w:r>
-    </w:p>
-    <w:p>
-      <w:pPr>
-        <w:pStyle w:val="FirstParagraph"/>
-      </w:pPr>
-      <w:r>
-        <w:t xml:space="preserve">Prisen er fast i tre år, og reguleres deretter etter konsumprisindeksen.</w:t>
-      </w:r>
-    </w:p>
-    <w:p>
-      <w:pPr>
-        <w:pStyle w:val="BodyText"/>
-      </w:pPr>
-      <w:r>
-        <w:t xml:space="preserve">All statistikk er fritt tilgjengelig. Vi tar ikke betalt av klubber, utøvere</w:t>
-      </w:r>
-      <w:r>
-        <w:t xml:space="preserve"> </w:t>
-      </w:r>
-      <w:r>
-        <w:t xml:space="preserve">eller publikum.</w:t>
-      </w:r>
-    </w:p>
-    <w:p>
-      <w:pPr>
-        <w:pStyle w:val="BodyText"/>
-      </w:pPr>
-      <w:r>
-        <w:rPr>
-          <w:b/>
-          <w:bCs/>
-        </w:rPr>
-        <w:t xml:space="preserve">3. Utvikling utenfor fastprisen</w:t>
+        <w:t xml:space="preserve">980 000</w:t>
+      </w:r>
+      <w:r>
+        <w:t xml:space="preserve"> </w:t>
+      </w:r>
+      <w:r>
+        <w:t xml:space="preserve">kr. Dette omfatter:</w:t>
       </w:r>
     </w:p>
     <w:p>
@@ -1082,7 +1125,7 @@
         </w:numPr>
       </w:pPr>
       <w:r>
-        <w:t xml:space="preserve">Integrasjon mot eksternt system:</w:t>
+        <w:t xml:space="preserve">Plattformen og datagrunnlaget som er i drift, overført til NFIF:</w:t>
       </w:r>
       <w:r>
         <w:t xml:space="preserve"> </w:t>
@@ -1091,13 +1134,13 @@
         <w:rPr>
           <w:highlight w:val="yellow"/>
         </w:rPr>
-        <w:t xml:space="preserve">90 000–150 000</w:t>
-      </w:r>
-      <w:r>
-        <w:t xml:space="preserve"> </w:t>
-      </w:r>
-      <w:r>
-        <w:t xml:space="preserve">kr per system</w:t>
+        <w:t xml:space="preserve">250 000</w:t>
+      </w:r>
+      <w:r>
+        <w:t xml:space="preserve"> </w:t>
+      </w:r>
+      <w:r>
+        <w:t xml:space="preserve">kr</w:t>
       </w:r>
     </w:p>
     <w:p>
@@ -1109,7 +1152,7 @@
         </w:numPr>
       </w:pPr>
       <w:r>
-        <w:t xml:space="preserve">Løp utenfor bane, full leveranse:</w:t>
+        <w:t xml:space="preserve">Masters, med femårsklasser og rekorder:</w:t>
       </w:r>
       <w:r>
         <w:t xml:space="preserve"> </w:t>
@@ -1118,7 +1161,7 @@
         <w:rPr>
           <w:highlight w:val="yellow"/>
         </w:rPr>
-        <w:t xml:space="preserve">450 000–600 000</w:t>
+        <w:t xml:space="preserve">100 000</w:t>
       </w:r>
       <w:r>
         <w:t xml:space="preserve"> </w:t>
@@ -1136,7 +1179,7 @@
         </w:numPr>
       </w:pPr>
       <w:r>
-        <w:t xml:space="preserve">Aktivitetsmodul og dashbord for forbund og kretser:</w:t>
+        <w:t xml:space="preserve">Opphenting og kontroll av eldre statistikk:</w:t>
       </w:r>
       <w:r>
         <w:t xml:space="preserve"> </w:t>
@@ -1145,7 +1188,7 @@
         <w:rPr>
           <w:highlight w:val="yellow"/>
         </w:rPr>
-        <w:t xml:space="preserve">200 000–300 000</w:t>
+        <w:t xml:space="preserve">200 000</w:t>
       </w:r>
       <w:r>
         <w:t xml:space="preserve"> </w:t>
@@ -1163,7 +1206,7 @@
         </w:numPr>
       </w:pPr>
       <w:r>
-        <w:t xml:space="preserve">Historisk utvidelse 2001–2012, inkludert kartlegging:</w:t>
+        <w:t xml:space="preserve">Kvalitetsnivå for resultater:</w:t>
       </w:r>
       <w:r>
         <w:t xml:space="preserve"> </w:t>
@@ -1172,7 +1215,7 @@
         <w:rPr>
           <w:highlight w:val="yellow"/>
         </w:rPr>
-        <w:t xml:space="preserve">200 000–300 000</w:t>
+        <w:t xml:space="preserve">140 000</w:t>
       </w:r>
       <w:r>
         <w:t xml:space="preserve"> </w:t>
@@ -1190,7 +1233,7 @@
         </w:numPr>
       </w:pPr>
       <w:r>
-        <w:t xml:space="preserve">Øvrig utvikling:</w:t>
+        <w:t xml:space="preserve">Dokumentert API:</w:t>
       </w:r>
       <w:r>
         <w:t xml:space="preserve"> </w:t>
@@ -1199,13 +1242,13 @@
         <w:rPr>
           <w:highlight w:val="yellow"/>
         </w:rPr>
-        <w:t xml:space="preserve">950</w:t>
-      </w:r>
-      <w:r>
-        <w:t xml:space="preserve"> </w:t>
-      </w:r>
-      <w:r>
-        <w:t xml:space="preserve">kr per time</w:t>
+        <w:t xml:space="preserve">140 000</w:t>
+      </w:r>
+      <w:r>
+        <w:t xml:space="preserve"> </w:t>
+      </w:r>
+      <w:r>
+        <w:t xml:space="preserve">kr</w:t>
       </w:r>
     </w:p>
     <w:p>
@@ -1217,6 +1260,375 @@
         </w:numPr>
       </w:pPr>
       <w:r>
+        <w:t xml:space="preserve">Kretsstatistikk:</w:t>
+      </w:r>
+      <w:r>
+        <w:t xml:space="preserve"> </w:t>
+      </w:r>
+      <w:r>
+        <w:rPr>
+          <w:highlight w:val="yellow"/>
+        </w:rPr>
+        <w:t xml:space="preserve">70 000</w:t>
+      </w:r>
+      <w:r>
+        <w:t xml:space="preserve"> </w:t>
+      </w:r>
+      <w:r>
+        <w:t xml:space="preserve">kr</w:t>
+      </w:r>
+    </w:p>
+    <w:p>
+      <w:pPr>
+        <w:pStyle w:val="Compact"/>
+        <w:numPr>
+          <w:ilvl w:val="0"/>
+          <w:numId w:val="1003"/>
+        </w:numPr>
+      </w:pPr>
+      <w:r>
+        <w:t xml:space="preserve">Dokumentasjon, personvernvurdering og databehandleravtale:</w:t>
+      </w:r>
+      <w:r>
+        <w:t xml:space="preserve"> </w:t>
+      </w:r>
+      <w:r>
+        <w:rPr>
+          <w:highlight w:val="yellow"/>
+        </w:rPr>
+        <w:t xml:space="preserve">80 000</w:t>
+      </w:r>
+      <w:r>
+        <w:t xml:space="preserve"> </w:t>
+      </w:r>
+      <w:r>
+        <w:t xml:space="preserve">kr</w:t>
+      </w:r>
+    </w:p>
+    <w:p>
+      <w:pPr>
+        <w:pStyle w:val="FirstParagraph"/>
+      </w:pPr>
+      <w:r>
+        <w:t xml:space="preserve">Beløpet faktureres mot milepæler. Siste del faktureres først etter 90 dagers</w:t>
+      </w:r>
+      <w:r>
+        <w:t xml:space="preserve"> </w:t>
+      </w:r>
+      <w:r>
+        <w:t xml:space="preserve">godkjent drift.</w:t>
+      </w:r>
+    </w:p>
+    <w:p>
+      <w:pPr>
+        <w:pStyle w:val="BodyText"/>
+      </w:pPr>
+      <w:r>
+        <w:t xml:space="preserve">Årlig drift, fastpris</w:t>
+      </w:r>
+      <w:r>
+        <w:t xml:space="preserve"> </w:t>
+      </w:r>
+      <w:r>
+        <w:rPr>
+          <w:highlight w:val="yellow"/>
+        </w:rPr>
+        <w:t xml:space="preserve">290 000</w:t>
+      </w:r>
+      <w:r>
+        <w:t xml:space="preserve"> </w:t>
+      </w:r>
+      <w:r>
+        <w:t xml:space="preserve">kr per år. Dette omfatter:</w:t>
+      </w:r>
+    </w:p>
+    <w:p>
+      <w:pPr>
+        <w:pStyle w:val="Compact"/>
+        <w:numPr>
+          <w:ilvl w:val="0"/>
+          <w:numId w:val="1004"/>
+        </w:numPr>
+      </w:pPr>
+      <w:r>
+        <w:t xml:space="preserve">Drift i EU/EØS, overvåking og sikkerhetskopi:</w:t>
+      </w:r>
+      <w:r>
+        <w:t xml:space="preserve"> </w:t>
+      </w:r>
+      <w:r>
+        <w:rPr>
+          <w:highlight w:val="yellow"/>
+        </w:rPr>
+        <w:t xml:space="preserve">90 000</w:t>
+      </w:r>
+      <w:r>
+        <w:t xml:space="preserve"> </w:t>
+      </w:r>
+      <w:r>
+        <w:t xml:space="preserve">kr</w:t>
+      </w:r>
+    </w:p>
+    <w:p>
+      <w:pPr>
+        <w:pStyle w:val="Compact"/>
+        <w:numPr>
+          <w:ilvl w:val="0"/>
+          <w:numId w:val="1004"/>
+        </w:numPr>
+      </w:pPr>
+      <w:r>
+        <w:t xml:space="preserve">Registrering av alle resultater, kontroll mot kilden og vedlikehold av</w:t>
+      </w:r>
+      <w:r>
+        <w:t xml:space="preserve"> </w:t>
+      </w:r>
+      <w:r>
+        <w:t xml:space="preserve">basen:</w:t>
+      </w:r>
+      <w:r>
+        <w:t xml:space="preserve"> </w:t>
+      </w:r>
+      <w:r>
+        <w:rPr>
+          <w:highlight w:val="yellow"/>
+        </w:rPr>
+        <w:t xml:space="preserve">200 000</w:t>
+      </w:r>
+      <w:r>
+        <w:t xml:space="preserve"> </w:t>
+      </w:r>
+      <w:r>
+        <w:t xml:space="preserve">kr</w:t>
+      </w:r>
+    </w:p>
+    <w:p>
+      <w:pPr>
+        <w:pStyle w:val="FirstParagraph"/>
+      </w:pPr>
+      <w:r>
+        <w:t xml:space="preserve">Prisen er fast i tre år, og reguleres deretter etter konsumprisindeksen.</w:t>
+      </w:r>
+      <w:r>
+        <w:t xml:space="preserve"> </w:t>
+      </w:r>
+      <w:r>
+        <w:t xml:space="preserve">All statistikk er fritt tilgjengelig. Vi tar ikke betalt av klubber, utøvere</w:t>
+      </w:r>
+      <w:r>
+        <w:t xml:space="preserve"> </w:t>
+      </w:r>
+      <w:r>
+        <w:t xml:space="preserve">eller publikum.</w:t>
+      </w:r>
+    </w:p>
+    <w:p>
+      <w:pPr>
+        <w:pStyle w:val="BodyText"/>
+      </w:pPr>
+      <w:r>
+        <w:rPr>
+          <w:b/>
+          <w:bCs/>
+        </w:rPr>
+        <w:t xml:space="preserve">2. Gateløp</w:t>
+      </w:r>
+    </w:p>
+    <w:p>
+      <w:pPr>
+        <w:pStyle w:val="Compact"/>
+        <w:numPr>
+          <w:ilvl w:val="0"/>
+          <w:numId w:val="1005"/>
+        </w:numPr>
+      </w:pPr>
+      <w:r>
+        <w:t xml:space="preserve">Etablering:</w:t>
+      </w:r>
+      <w:r>
+        <w:t xml:space="preserve"> </w:t>
+      </w:r>
+      <w:r>
+        <w:rPr>
+          <w:highlight w:val="yellow"/>
+        </w:rPr>
+        <w:t xml:space="preserve">450 000–600 000</w:t>
+      </w:r>
+      <w:r>
+        <w:t xml:space="preserve"> </w:t>
+      </w:r>
+      <w:r>
+        <w:t xml:space="preserve">kr, fastsettes etter kartlegging av</w:t>
+      </w:r>
+      <w:r>
+        <w:t xml:space="preserve"> </w:t>
+      </w:r>
+      <w:r>
+        <w:t xml:space="preserve">tidtakernes data</w:t>
+      </w:r>
+    </w:p>
+    <w:p>
+      <w:pPr>
+        <w:pStyle w:val="Compact"/>
+        <w:numPr>
+          <w:ilvl w:val="0"/>
+          <w:numId w:val="1005"/>
+        </w:numPr>
+      </w:pPr>
+      <w:r>
+        <w:t xml:space="preserve">Årlig registrering og vedlikehold:</w:t>
+      </w:r>
+      <w:r>
+        <w:t xml:space="preserve"> </w:t>
+      </w:r>
+      <w:r>
+        <w:rPr>
+          <w:highlight w:val="yellow"/>
+        </w:rPr>
+        <w:t xml:space="preserve">100 000</w:t>
+      </w:r>
+      <w:r>
+        <w:t xml:space="preserve"> </w:t>
+      </w:r>
+      <w:r>
+        <w:t xml:space="preserve">kr</w:t>
+      </w:r>
+    </w:p>
+    <w:p>
+      <w:pPr>
+        <w:pStyle w:val="FirstParagraph"/>
+      </w:pPr>
+      <w:r>
+        <w:rPr>
+          <w:b/>
+          <w:bCs/>
+        </w:rPr>
+        <w:t xml:space="preserve">3. Tillegg som bestilles ved behov</w:t>
+      </w:r>
+    </w:p>
+    <w:p>
+      <w:pPr>
+        <w:pStyle w:val="Compact"/>
+        <w:numPr>
+          <w:ilvl w:val="0"/>
+          <w:numId w:val="1006"/>
+        </w:numPr>
+      </w:pPr>
+      <w:r>
+        <w:t xml:space="preserve">Integrasjon mot eksternt system:</w:t>
+      </w:r>
+      <w:r>
+        <w:t xml:space="preserve"> </w:t>
+      </w:r>
+      <w:r>
+        <w:rPr>
+          <w:highlight w:val="yellow"/>
+        </w:rPr>
+        <w:t xml:space="preserve">90 000–150 000</w:t>
+      </w:r>
+      <w:r>
+        <w:t xml:space="preserve"> </w:t>
+      </w:r>
+      <w:r>
+        <w:t xml:space="preserve">kr per system</w:t>
+      </w:r>
+    </w:p>
+    <w:p>
+      <w:pPr>
+        <w:pStyle w:val="Compact"/>
+        <w:numPr>
+          <w:ilvl w:val="0"/>
+          <w:numId w:val="1006"/>
+        </w:numPr>
+      </w:pPr>
+      <w:r>
+        <w:t xml:space="preserve">Aktivitetsmodul og dashbord for forbund og kretser:</w:t>
+      </w:r>
+      <w:r>
+        <w:t xml:space="preserve"> </w:t>
+      </w:r>
+      <w:r>
+        <w:rPr>
+          <w:highlight w:val="yellow"/>
+        </w:rPr>
+        <w:t xml:space="preserve">200 000–300 000</w:t>
+      </w:r>
+      <w:r>
+        <w:t xml:space="preserve"> </w:t>
+      </w:r>
+      <w:r>
+        <w:t xml:space="preserve">kr</w:t>
+      </w:r>
+    </w:p>
+    <w:p>
+      <w:pPr>
+        <w:pStyle w:val="Compact"/>
+        <w:numPr>
+          <w:ilvl w:val="0"/>
+          <w:numId w:val="1006"/>
+        </w:numPr>
+      </w:pPr>
+      <w:r>
+        <w:t xml:space="preserve">Analyse, med to mesterskapspakker og én årsrapport:</w:t>
+      </w:r>
+      <w:r>
+        <w:t xml:space="preserve"> </w:t>
+      </w:r>
+      <w:r>
+        <w:rPr>
+          <w:highlight w:val="yellow"/>
+        </w:rPr>
+        <w:t xml:space="preserve">80 000</w:t>
+      </w:r>
+      <w:r>
+        <w:t xml:space="preserve"> </w:t>
+      </w:r>
+      <w:r>
+        <w:t xml:space="preserve">kr</w:t>
+      </w:r>
+      <w:r>
+        <w:t xml:space="preserve"> </w:t>
+      </w:r>
+      <w:r>
+        <w:t xml:space="preserve">per år</w:t>
+      </w:r>
+    </w:p>
+    <w:p>
+      <w:pPr>
+        <w:pStyle w:val="Compact"/>
+        <w:numPr>
+          <w:ilvl w:val="0"/>
+          <w:numId w:val="1006"/>
+        </w:numPr>
+      </w:pPr>
+      <w:r>
+        <w:t xml:space="preserve">Øvrig utvikling:</w:t>
+      </w:r>
+      <w:r>
+        <w:t xml:space="preserve"> </w:t>
+      </w:r>
+      <w:r>
+        <w:rPr>
+          <w:highlight w:val="yellow"/>
+        </w:rPr>
+        <w:t xml:space="preserve">950</w:t>
+      </w:r>
+      <w:r>
+        <w:t xml:space="preserve"> </w:t>
+      </w:r>
+      <w:r>
+        <w:t xml:space="preserve">kr per time</w:t>
+      </w:r>
+    </w:p>
+    <w:p>
+      <w:pPr>
+        <w:pStyle w:val="Compact"/>
+        <w:numPr>
+          <w:ilvl w:val="0"/>
+          <w:numId w:val="1006"/>
+        </w:numPr>
+      </w:pPr>
+      <w:r>
         <w:t xml:space="preserve">Analyse og utredning på bestilling:</w:t>
       </w:r>
       <w:r>
@@ -1240,7 +1652,7 @@
         <w:pStyle w:val="FirstParagraph"/>
       </w:pPr>
       <w:r>
-        <w:t xml:space="preserve">Dette er anslag, og vi fakturerer medgått tid. Arbeid utover avtalt ramme</w:t>
+        <w:t xml:space="preserve">Tilleggene faktureres etter medgått tid. Arbeid utover avtalt ramme</w:t>
       </w:r>
       <w:r>
         <w:t xml:space="preserve"> </w:t>
@@ -1266,11 +1678,11 @@
         <w:pStyle w:val="Compact"/>
         <w:numPr>
           <w:ilvl w:val="0"/>
-          <w:numId w:val="1004"/>
+          <w:numId w:val="1007"/>
         </w:numPr>
       </w:pPr>
       <w:r>
-        <w:t xml:space="preserve">Etablering og drift:</w:t>
+        <w:t xml:space="preserve">Nasjonal banestatistikk:</w:t>
       </w:r>
       <w:r>
         <w:t xml:space="preserve"> </w:t>
@@ -1279,7 +1691,7 @@
         <w:rPr>
           <w:highlight w:val="yellow"/>
         </w:rPr>
-        <w:t xml:space="preserve">3 350 000</w:t>
+        <w:t xml:space="preserve">2 430 000</w:t>
       </w:r>
       <w:r>
         <w:t xml:space="preserve"> </w:t>
@@ -1293,11 +1705,11 @@
         <w:pStyle w:val="Compact"/>
         <w:numPr>
           <w:ilvl w:val="0"/>
-          <w:numId w:val="1004"/>
+          <w:numId w:val="1007"/>
         </w:numPr>
       </w:pPr>
       <w:r>
-        <w:t xml:space="preserve">Med løp utenfor bane, to integrasjoner og aktivitetsmodulen: om lag</w:t>
+        <w:t xml:space="preserve">Banestatistikk og gateløp: om lag</w:t>
       </w:r>
       <w:r>
         <w:t xml:space="preserve"> </w:t>
@@ -1306,7 +1718,7 @@
         <w:rPr>
           <w:highlight w:val="yellow"/>
         </w:rPr>
-        <w:t xml:space="preserve">4,2–4,6</w:t>
+        <w:t xml:space="preserve">3,4–3,5</w:t>
       </w:r>
       <w:r>
         <w:t xml:space="preserve"> </w:t>
@@ -1320,11 +1732,11 @@
         <w:pStyle w:val="Compact"/>
         <w:numPr>
           <w:ilvl w:val="0"/>
-          <w:numId w:val="1004"/>
+          <w:numId w:val="1007"/>
         </w:numPr>
       </w:pPr>
       <w:r>
-        <w:t xml:space="preserve">Med alle postene over: om lag</w:t>
+        <w:t xml:space="preserve">Med analyse, aktivitetsmodul og to integrasjoner i tillegg: om lag</w:t>
       </w:r>
       <w:r>
         <w:t xml:space="preserve"> </w:t>
@@ -1333,7 +1745,7 @@
         <w:rPr>
           <w:highlight w:val="yellow"/>
         </w:rPr>
-        <w:t xml:space="preserve">4,7–5,3</w:t>
+        <w:t xml:space="preserve">4,2–4,5</w:t>
       </w:r>
       <w:r>
         <w:t xml:space="preserve"> </w:t>
@@ -1399,7 +1811,7 @@
         <w:pStyle w:val="Compact"/>
         <w:numPr>
           <w:ilvl w:val="0"/>
-          <w:numId w:val="1005"/>
+          <w:numId w:val="1008"/>
         </w:numPr>
       </w:pPr>
       <w:r>
@@ -1409,7 +1821,7 @@
         <w:t xml:space="preserve"> </w:t>
       </w:r>
       <w:r>
-        <w:t xml:space="preserve">Femårstallene står i regnearkets punkt 4, der lav er venstre og høy er</w:t>
+        <w:t xml:space="preserve">Femårstallene står i regnearkets punkt 5, der lav er venstre og høy er</w:t>
       </w:r>
       <w:r>
         <w:t xml:space="preserve"> </w:t>
@@ -1423,7 +1835,7 @@
         <w:pStyle w:val="Compact"/>
         <w:numPr>
           <w:ilvl w:val="0"/>
-          <w:numId w:val="1005"/>
+          <w:numId w:val="1008"/>
         </w:numPr>
       </w:pPr>
       <w:r>
@@ -1435,7 +1847,7 @@
         <w:pStyle w:val="Compact"/>
         <w:numPr>
           <w:ilvl w:val="0"/>
-          <w:numId w:val="1005"/>
+          <w:numId w:val="1008"/>
         </w:numPr>
       </w:pPr>
       <w:r>
@@ -1447,7 +1859,7 @@
         <w:pStyle w:val="Compact"/>
         <w:numPr>
           <w:ilvl w:val="0"/>
-          <w:numId w:val="1005"/>
+          <w:numId w:val="1008"/>
         </w:numPr>
       </w:pPr>
       <w:r>
@@ -1796,6 +2208,15 @@
     <w:abstractNumId w:val="991"/>
   </w:num>
   <w:num w:numId="1005">
+    <w:abstractNumId w:val="991"/>
+  </w:num>
+  <w:num w:numId="1006">
+    <w:abstractNumId w:val="991"/>
+  </w:num>
+  <w:num w:numId="1007">
+    <w:abstractNumId w:val="991"/>
+  </w:num>
+  <w:num w:numId="1008">
     <w:abstractNumId w:val="99411"/>
     <w:lvlOverride w:ilvl="0">
       <w:startOverride w:val="1"/>

</xml_diff>